<commit_message>
fix: correct practical work 1 and related diagram
</commit_message>
<xml_diff>
--- a/Практическая_работа_1_Система_управления_мероприятиями.docx
+++ b/Практическая_работа_1_Система_управления_мероприятиями.docx
@@ -52,15 +52,12 @@
     </w:p>
     <w:p>
       <w:pPr>
-        <w:jc w:val="center"/>
         <w:rPr>
-          <w:sz w:val="22"/>
           <w:lang w:val="ru-RU"/>
         </w:rPr>
       </w:pPr>
       <w:r>
         <w:rPr>
-          <w:sz w:val="22"/>
           <w:lang w:val="ru-RU"/>
         </w:rPr>
         <w:t>1. Диаграмма вариантов использования</w:t>
@@ -123,10 +120,10 @@
           <w:lang w:val="ru-RU"/>
         </w:rPr>
         <w:drawing>
-          <wp:inline distT="0" distB="0" distL="0" distR="0" wp14:anchorId="4AB60FD2" wp14:editId="152F579D">
-            <wp:extent cx="6063506" cy="4132162"/>
-            <wp:effectExtent l="0" t="0" r="0" b="1905"/>
-            <wp:docPr id="439134049" name="Рисунок 1"/>
+          <wp:inline distT="0" distB="0" distL="0" distR="0" wp14:anchorId="100CD52C" wp14:editId="58E9230A">
+            <wp:extent cx="5932025" cy="4144010"/>
+            <wp:effectExtent l="0" t="0" r="0" b="8890"/>
+            <wp:docPr id="59920332" name="Рисунок 1"/>
             <wp:cNvGraphicFramePr>
               <a:graphicFrameLocks xmlns:a="http://schemas.openxmlformats.org/drawingml/2006/main" noChangeAspect="1"/>
             </wp:cNvGraphicFramePr>
@@ -134,32 +131,23 @@
               <a:graphicData uri="http://schemas.openxmlformats.org/drawingml/2006/picture">
                 <pic:pic xmlns:pic="http://schemas.openxmlformats.org/drawingml/2006/picture">
                   <pic:nvPicPr>
-                    <pic:cNvPr id="439134049" name=""/>
+                    <pic:cNvPr id="59920332" name=""/>
                     <pic:cNvPicPr/>
                   </pic:nvPicPr>
-                  <pic:blipFill rotWithShape="1">
+                  <pic:blipFill>
                     <a:blip r:embed="rId8"/>
-                    <a:srcRect t="5315" b="11423"/>
                     <a:stretch>
                       <a:fillRect/>
                     </a:stretch>
                   </pic:blipFill>
-                  <pic:spPr bwMode="auto">
+                  <pic:spPr>
                     <a:xfrm>
                       <a:off x="0" y="0"/>
-                      <a:ext cx="6073664" cy="4139084"/>
+                      <a:ext cx="5933702" cy="4145182"/>
                     </a:xfrm>
                     <a:prstGeom prst="rect">
                       <a:avLst/>
                     </a:prstGeom>
-                    <a:ln>
-                      <a:noFill/>
-                    </a:ln>
-                    <a:extLst>
-                      <a:ext uri="{53640926-AAD7-44D8-BBD7-CCE9431645EC}">
-                        <a14:shadowObscured xmlns:a14="http://schemas.microsoft.com/office/drawing/2010/main"/>
-                      </a:ext>
-                    </a:extLst>
                   </pic:spPr>
                 </pic:pic>
               </a:graphicData>
@@ -774,7 +762,7 @@
               <w:rPr>
                 <w:sz w:val="22"/>
               </w:rPr>
-              <w:t>Система</w:t>
+              <w:t>Организатор</w:t>
             </w:r>
           </w:p>
         </w:tc>
@@ -1244,13 +1232,11 @@
     <w:p>
       <w:pPr>
         <w:rPr>
-          <w:sz w:val="22"/>
           <w:lang w:val="ru-RU"/>
         </w:rPr>
       </w:pPr>
       <w:r>
         <w:rPr>
-          <w:sz w:val="22"/>
           <w:lang w:val="ru-RU"/>
         </w:rPr>
         <w:t>2. Диаграмма классов</w:t>
@@ -1269,7 +1255,133 @@
           <w:sz w:val="22"/>
           <w:lang w:val="ru-RU"/>
         </w:rPr>
-        <w:t>Диаграмма классов описывает основные сущности системы и связи между ними. Связь участника с мероприятием выполняется через класс «Регистрация», что позволяет хранить сведения о дате регистрации, статусе и факте присутствия. Для программы и её секций использована композиция.</w:t>
+        <w:t xml:space="preserve">Диаграмма классов описывает основные сущности системы и связи между ними. Связь участника с мероприятием выполняется через класс «Регистрация», что позволяет хранить сведения о дате регистрации, статусе и факте присутствия. </w:t>
+      </w:r>
+      <w:r>
+        <w:rPr>
+          <w:sz w:val="22"/>
+          <w:lang w:val="ru-RU"/>
+        </w:rPr>
+        <w:t xml:space="preserve">Между классами </w:t>
+      </w:r>
+      <w:r>
+        <w:rPr>
+          <w:sz w:val="22"/>
+          <w:lang w:val="ru-RU"/>
+        </w:rPr>
+        <w:t>«</w:t>
+      </w:r>
+      <w:r>
+        <w:rPr>
+          <w:sz w:val="22"/>
+          <w:lang w:val="ru-RU"/>
+        </w:rPr>
+        <w:t>Мероприятие</w:t>
+      </w:r>
+      <w:r>
+        <w:rPr>
+          <w:sz w:val="22"/>
+          <w:lang w:val="ru-RU"/>
+        </w:rPr>
+        <w:t>»</w:t>
+      </w:r>
+      <w:r>
+        <w:rPr>
+          <w:sz w:val="22"/>
+          <w:lang w:val="ru-RU"/>
+        </w:rPr>
+        <w:t xml:space="preserve"> и </w:t>
+      </w:r>
+      <w:r>
+        <w:rPr>
+          <w:sz w:val="22"/>
+          <w:lang w:val="ru-RU"/>
+        </w:rPr>
+        <w:t>«</w:t>
+      </w:r>
+      <w:r>
+        <w:rPr>
+          <w:sz w:val="22"/>
+          <w:lang w:val="ru-RU"/>
+        </w:rPr>
+        <w:t>Программа</w:t>
+      </w:r>
+      <w:r>
+        <w:rPr>
+          <w:sz w:val="22"/>
+          <w:lang w:val="ru-RU"/>
+        </w:rPr>
+        <w:t>»</w:t>
+      </w:r>
+      <w:r>
+        <w:rPr>
+          <w:sz w:val="22"/>
+          <w:lang w:val="ru-RU"/>
+        </w:rPr>
+        <w:t xml:space="preserve">, а также </w:t>
+      </w:r>
+      <w:r>
+        <w:rPr>
+          <w:sz w:val="22"/>
+          <w:lang w:val="ru-RU"/>
+        </w:rPr>
+        <w:t>«</w:t>
+      </w:r>
+      <w:r>
+        <w:rPr>
+          <w:sz w:val="22"/>
+          <w:lang w:val="ru-RU"/>
+        </w:rPr>
+        <w:t>Программа</w:t>
+      </w:r>
+      <w:r>
+        <w:rPr>
+          <w:sz w:val="22"/>
+          <w:lang w:val="ru-RU"/>
+        </w:rPr>
+        <w:t>»</w:t>
+      </w:r>
+      <w:r>
+        <w:rPr>
+          <w:sz w:val="22"/>
+          <w:lang w:val="ru-RU"/>
+        </w:rPr>
+        <w:t xml:space="preserve"> и </w:t>
+      </w:r>
+      <w:r>
+        <w:rPr>
+          <w:sz w:val="22"/>
+          <w:lang w:val="ru-RU"/>
+        </w:rPr>
+        <w:t>«</w:t>
+      </w:r>
+      <w:r>
+        <w:rPr>
+          <w:sz w:val="22"/>
+          <w:lang w:val="ru-RU"/>
+        </w:rPr>
+        <w:t>Секция</w:t>
+      </w:r>
+      <w:r>
+        <w:rPr>
+          <w:sz w:val="22"/>
+          <w:lang w:val="ru-RU"/>
+        </w:rPr>
+        <w:t>»</w:t>
+      </w:r>
+      <w:r>
+        <w:rPr>
+          <w:sz w:val="22"/>
+          <w:lang w:val="ru-RU"/>
+        </w:rPr>
+        <w:t xml:space="preserve"> использована композиция, отражающая зависимость частей от соответствующего целого</w:t>
+      </w:r>
+      <w:r>
+        <w:rPr>
+          <w:sz w:val="22"/>
+          <w:lang w:val="ru-RU"/>
+        </w:rPr>
+        <w:t>.</w:t>
       </w:r>
       <w:r>
         <w:rPr>
@@ -1290,10 +1402,10 @@
           <w:lang w:val="ru-RU"/>
         </w:rPr>
         <w:drawing>
-          <wp:inline distT="0" distB="0" distL="0" distR="0" wp14:anchorId="05DD7A79" wp14:editId="73E0F1DC">
-            <wp:extent cx="5366173" cy="4444679"/>
-            <wp:effectExtent l="0" t="0" r="6350" b="0"/>
-            <wp:docPr id="1548586938" name="Рисунок 1"/>
+          <wp:inline distT="0" distB="0" distL="0" distR="0" wp14:anchorId="1D54687F" wp14:editId="3317E1BD">
+            <wp:extent cx="5567423" cy="4340050"/>
+            <wp:effectExtent l="0" t="0" r="0" b="3810"/>
+            <wp:docPr id="156418667" name="Рисунок 1"/>
             <wp:cNvGraphicFramePr>
               <a:graphicFrameLocks xmlns:a="http://schemas.openxmlformats.org/drawingml/2006/main" noChangeAspect="1"/>
             </wp:cNvGraphicFramePr>
@@ -1301,7 +1413,7 @@
               <a:graphicData uri="http://schemas.openxmlformats.org/drawingml/2006/picture">
                 <pic:pic xmlns:pic="http://schemas.openxmlformats.org/drawingml/2006/picture">
                   <pic:nvPicPr>
-                    <pic:cNvPr id="1548586938" name=""/>
+                    <pic:cNvPr id="156418667" name=""/>
                     <pic:cNvPicPr/>
                   </pic:nvPicPr>
                   <pic:blipFill>
@@ -1313,7 +1425,7 @@
                   <pic:spPr>
                     <a:xfrm>
                       <a:off x="0" y="0"/>
-                      <a:ext cx="5408295" cy="4479568"/>
+                      <a:ext cx="5589740" cy="4357447"/>
                     </a:xfrm>
                     <a:prstGeom prst="rect">
                       <a:avLst/>
@@ -1340,15 +1452,6 @@
         </w:rPr>
         <w:br w:type="page"/>
       </w:r>
-    </w:p>
-    <w:p>
-      <w:pPr>
-        <w:spacing w:line="276" w:lineRule="auto"/>
-        <w:ind w:firstLine="0"/>
-        <w:rPr>
-          <w:lang w:val="ru-RU"/>
-        </w:rPr>
-      </w:pPr>
       <w:r>
         <w:rPr>
           <w:lang w:val="ru-RU"/>
@@ -1821,6 +1924,7 @@
       </w:tr>
       <w:tr>
         <w:trPr>
+          <w:trHeight w:val="46"/>
           <w:jc w:val="center"/>
         </w:trPr>
         <w:tc>
@@ -1864,17 +1968,21 @@
     <w:p>
       <w:pPr>
         <w:rPr>
-          <w:sz w:val="22"/>
+          <w:lang w:val="ru-RU"/>
+        </w:rPr>
+      </w:pPr>
+    </w:p>
+    <w:p>
+      <w:pPr>
+        <w:rPr>
+          <w:lang w:val="ru-RU"/>
         </w:rPr>
       </w:pPr>
       <w:r>
         <w:rPr>
-          <w:sz w:val="22"/>
+          <w:lang w:val="ru-RU"/>
         </w:rPr>
-        <w:t>3</w:t>
-      </w:r>
-      <w:r>
-        <w:t>. Выделение модулей и оценка ресурсов</w:t>
+        <w:t>3. Выделение модулей и оценка ресурсов</w:t>
       </w:r>
     </w:p>
     <w:p>
@@ -2107,28 +2215,14 @@
             <w:pPr>
               <w:ind w:firstLine="0"/>
               <w:jc w:val="center"/>
+              <w:rPr>
+                <w:lang w:val="ru-RU"/>
+              </w:rPr>
             </w:pPr>
             <w:r>
               <w:rPr>
                 <w:sz w:val="22"/>
-              </w:rPr>
-              <w:t>3</w:t>
-            </w:r>
-          </w:p>
-        </w:tc>
-        <w:tc>
-          <w:tcPr>
-            <w:tcW w:w="1211" w:type="dxa"/>
-            <w:vAlign w:val="center"/>
-          </w:tcPr>
-          <w:p>
-            <w:pPr>
-              <w:ind w:firstLine="0"/>
-              <w:jc w:val="center"/>
-            </w:pPr>
-            <w:r>
-              <w:rPr>
-                <w:sz w:val="22"/>
+                <w:lang w:val="ru-RU"/>
               </w:rPr>
               <w:t>1</w:t>
             </w:r>
@@ -2143,10 +2237,80 @@
             <w:pPr>
               <w:ind w:firstLine="0"/>
               <w:jc w:val="center"/>
+              <w:rPr>
+                <w:lang w:val="ru-RU"/>
+              </w:rPr>
             </w:pPr>
             <w:r>
               <w:rPr>
                 <w:sz w:val="22"/>
+                <w:lang w:val="ru-RU"/>
+              </w:rPr>
+              <w:t>0</w:t>
+            </w:r>
+          </w:p>
+        </w:tc>
+        <w:tc>
+          <w:tcPr>
+            <w:tcW w:w="1211" w:type="dxa"/>
+            <w:vAlign w:val="center"/>
+          </w:tcPr>
+          <w:p>
+            <w:pPr>
+              <w:ind w:firstLine="0"/>
+              <w:jc w:val="center"/>
+              <w:rPr>
+                <w:lang w:val="ru-RU"/>
+              </w:rPr>
+            </w:pPr>
+            <w:r>
+              <w:rPr>
+                <w:sz w:val="22"/>
+                <w:lang w:val="ru-RU"/>
+              </w:rPr>
+              <w:t>1</w:t>
+            </w:r>
+          </w:p>
+        </w:tc>
+        <w:tc>
+          <w:tcPr>
+            <w:tcW w:w="1211" w:type="dxa"/>
+            <w:vAlign w:val="center"/>
+          </w:tcPr>
+          <w:p>
+            <w:pPr>
+              <w:ind w:firstLine="0"/>
+              <w:jc w:val="center"/>
+              <w:rPr>
+                <w:lang w:val="ru-RU"/>
+              </w:rPr>
+            </w:pPr>
+            <w:r>
+              <w:rPr>
+                <w:sz w:val="22"/>
+                <w:lang w:val="ru-RU"/>
+              </w:rPr>
+              <w:t>0</w:t>
+            </w:r>
+          </w:p>
+        </w:tc>
+        <w:tc>
+          <w:tcPr>
+            <w:tcW w:w="1211" w:type="dxa"/>
+            <w:vAlign w:val="center"/>
+          </w:tcPr>
+          <w:p>
+            <w:pPr>
+              <w:ind w:firstLine="0"/>
+              <w:jc w:val="center"/>
+              <w:rPr>
+                <w:lang w:val="ru-RU"/>
+              </w:rPr>
+            </w:pPr>
+            <w:r>
+              <w:rPr>
+                <w:sz w:val="22"/>
+                <w:lang w:val="ru-RU"/>
               </w:rPr>
               <w:t>2</w:t>
             </w:r>
@@ -2161,48 +2325,22 @@
             <w:pPr>
               <w:ind w:firstLine="0"/>
               <w:jc w:val="center"/>
+              <w:rPr>
+                <w:lang w:val="ru-RU"/>
+              </w:rPr>
             </w:pPr>
             <w:r>
               <w:rPr>
                 <w:sz w:val="22"/>
               </w:rPr>
-              <w:t>1</w:t>
+              <w:t>2,</w:t>
             </w:r>
-          </w:p>
-        </w:tc>
-        <w:tc>
-          <w:tcPr>
-            <w:tcW w:w="1211" w:type="dxa"/>
-            <w:vAlign w:val="center"/>
-          </w:tcPr>
-          <w:p>
-            <w:pPr>
-              <w:ind w:firstLine="0"/>
-              <w:jc w:val="center"/>
-            </w:pPr>
             <w:r>
               <w:rPr>
                 <w:sz w:val="22"/>
+                <w:lang w:val="ru-RU"/>
               </w:rPr>
-              <w:t>7</w:t>
-            </w:r>
-          </w:p>
-        </w:tc>
-        <w:tc>
-          <w:tcPr>
-            <w:tcW w:w="1211" w:type="dxa"/>
-            <w:vAlign w:val="center"/>
-          </w:tcPr>
-          <w:p>
-            <w:pPr>
-              <w:ind w:firstLine="0"/>
-              <w:jc w:val="center"/>
-            </w:pPr>
-            <w:r>
-              <w:rPr>
-                <w:sz w:val="22"/>
-              </w:rPr>
-              <w:t>2,33</w:t>
+              <w:t>18</w:t>
             </w:r>
           </w:p>
         </w:tc>
@@ -2256,28 +2394,14 @@
             <w:pPr>
               <w:ind w:firstLine="0"/>
               <w:jc w:val="center"/>
+              <w:rPr>
+                <w:lang w:val="ru-RU"/>
+              </w:rPr>
             </w:pPr>
             <w:r>
               <w:rPr>
                 <w:sz w:val="22"/>
-              </w:rPr>
-              <w:t>3</w:t>
-            </w:r>
-          </w:p>
-        </w:tc>
-        <w:tc>
-          <w:tcPr>
-            <w:tcW w:w="1211" w:type="dxa"/>
-            <w:vAlign w:val="center"/>
-          </w:tcPr>
-          <w:p>
-            <w:pPr>
-              <w:ind w:firstLine="0"/>
-              <w:jc w:val="center"/>
-            </w:pPr>
-            <w:r>
-              <w:rPr>
-                <w:sz w:val="22"/>
+                <w:lang w:val="ru-RU"/>
               </w:rPr>
               <w:t>1</w:t>
             </w:r>
@@ -2292,10 +2416,80 @@
             <w:pPr>
               <w:ind w:firstLine="0"/>
               <w:jc w:val="center"/>
+              <w:rPr>
+                <w:lang w:val="ru-RU"/>
+              </w:rPr>
             </w:pPr>
             <w:r>
               <w:rPr>
                 <w:sz w:val="22"/>
+                <w:lang w:val="ru-RU"/>
+              </w:rPr>
+              <w:t>0</w:t>
+            </w:r>
+          </w:p>
+        </w:tc>
+        <w:tc>
+          <w:tcPr>
+            <w:tcW w:w="1211" w:type="dxa"/>
+            <w:vAlign w:val="center"/>
+          </w:tcPr>
+          <w:p>
+            <w:pPr>
+              <w:ind w:firstLine="0"/>
+              <w:jc w:val="center"/>
+              <w:rPr>
+                <w:lang w:val="ru-RU"/>
+              </w:rPr>
+            </w:pPr>
+            <w:r>
+              <w:rPr>
+                <w:sz w:val="22"/>
+                <w:lang w:val="ru-RU"/>
+              </w:rPr>
+              <w:t>1</w:t>
+            </w:r>
+          </w:p>
+        </w:tc>
+        <w:tc>
+          <w:tcPr>
+            <w:tcW w:w="1211" w:type="dxa"/>
+            <w:vAlign w:val="center"/>
+          </w:tcPr>
+          <w:p>
+            <w:pPr>
+              <w:ind w:firstLine="0"/>
+              <w:jc w:val="center"/>
+              <w:rPr>
+                <w:lang w:val="ru-RU"/>
+              </w:rPr>
+            </w:pPr>
+            <w:r>
+              <w:rPr>
+                <w:sz w:val="22"/>
+                <w:lang w:val="ru-RU"/>
+              </w:rPr>
+              <w:t>0</w:t>
+            </w:r>
+          </w:p>
+        </w:tc>
+        <w:tc>
+          <w:tcPr>
+            <w:tcW w:w="1211" w:type="dxa"/>
+            <w:vAlign w:val="center"/>
+          </w:tcPr>
+          <w:p>
+            <w:pPr>
+              <w:ind w:firstLine="0"/>
+              <w:jc w:val="center"/>
+              <w:rPr>
+                <w:lang w:val="ru-RU"/>
+              </w:rPr>
+            </w:pPr>
+            <w:r>
+              <w:rPr>
+                <w:sz w:val="22"/>
+                <w:lang w:val="ru-RU"/>
               </w:rPr>
               <w:t>2</w:t>
             </w:r>
@@ -2310,48 +2504,22 @@
             <w:pPr>
               <w:ind w:firstLine="0"/>
               <w:jc w:val="center"/>
+              <w:rPr>
+                <w:lang w:val="ru-RU"/>
+              </w:rPr>
             </w:pPr>
             <w:r>
               <w:rPr>
                 <w:sz w:val="22"/>
               </w:rPr>
-              <w:t>1</w:t>
+              <w:t>2,</w:t>
             </w:r>
-          </w:p>
-        </w:tc>
-        <w:tc>
-          <w:tcPr>
-            <w:tcW w:w="1211" w:type="dxa"/>
-            <w:vAlign w:val="center"/>
-          </w:tcPr>
-          <w:p>
-            <w:pPr>
-              <w:ind w:firstLine="0"/>
-              <w:jc w:val="center"/>
-            </w:pPr>
             <w:r>
               <w:rPr>
                 <w:sz w:val="22"/>
+                <w:lang w:val="ru-RU"/>
               </w:rPr>
-              <w:t>7</w:t>
-            </w:r>
-          </w:p>
-        </w:tc>
-        <w:tc>
-          <w:tcPr>
-            <w:tcW w:w="1211" w:type="dxa"/>
-            <w:vAlign w:val="center"/>
-          </w:tcPr>
-          <w:p>
-            <w:pPr>
-              <w:ind w:firstLine="0"/>
-              <w:jc w:val="center"/>
-            </w:pPr>
-            <w:r>
-              <w:rPr>
-                <w:sz w:val="22"/>
-              </w:rPr>
-              <w:t>2,33</w:t>
+              <w:t>18</w:t>
             </w:r>
           </w:p>
         </w:tc>
@@ -2405,12 +2573,60 @@
             <w:pPr>
               <w:ind w:firstLine="0"/>
               <w:jc w:val="center"/>
+              <w:rPr>
+                <w:lang w:val="ru-RU"/>
+              </w:rPr>
             </w:pPr>
             <w:r>
               <w:rPr>
                 <w:sz w:val="22"/>
+                <w:lang w:val="ru-RU"/>
               </w:rPr>
-              <w:t>2</w:t>
+              <w:t>1</w:t>
+            </w:r>
+          </w:p>
+        </w:tc>
+        <w:tc>
+          <w:tcPr>
+            <w:tcW w:w="1211" w:type="dxa"/>
+            <w:vAlign w:val="center"/>
+          </w:tcPr>
+          <w:p>
+            <w:pPr>
+              <w:ind w:firstLine="0"/>
+              <w:jc w:val="center"/>
+              <w:rPr>
+                <w:lang w:val="ru-RU"/>
+              </w:rPr>
+            </w:pPr>
+            <w:r>
+              <w:rPr>
+                <w:sz w:val="22"/>
+                <w:lang w:val="ru-RU"/>
+              </w:rPr>
+              <w:t>0</w:t>
+            </w:r>
+          </w:p>
+        </w:tc>
+        <w:tc>
+          <w:tcPr>
+            <w:tcW w:w="1211" w:type="dxa"/>
+            <w:vAlign w:val="center"/>
+          </w:tcPr>
+          <w:p>
+            <w:pPr>
+              <w:ind w:firstLine="0"/>
+              <w:jc w:val="center"/>
+              <w:rPr>
+                <w:lang w:val="ru-RU"/>
+              </w:rPr>
+            </w:pPr>
+            <w:r>
+              <w:rPr>
+                <w:sz w:val="22"/>
+                <w:lang w:val="ru-RU"/>
+              </w:rPr>
+              <w:t>1</w:t>
             </w:r>
           </w:p>
         </w:tc>
@@ -2441,12 +2657,16 @@
             <w:pPr>
               <w:ind w:firstLine="0"/>
               <w:jc w:val="center"/>
+              <w:rPr>
+                <w:lang w:val="ru-RU"/>
+              </w:rPr>
             </w:pPr>
             <w:r>
               <w:rPr>
                 <w:sz w:val="22"/>
+                <w:lang w:val="ru-RU"/>
               </w:rPr>
-              <w:t>2</w:t>
+              <w:t>3</w:t>
             </w:r>
           </w:p>
         </w:tc>
@@ -2459,48 +2679,16 @@
             <w:pPr>
               <w:ind w:firstLine="0"/>
               <w:jc w:val="center"/>
+              <w:rPr>
+                <w:lang w:val="ru-RU"/>
+              </w:rPr>
             </w:pPr>
             <w:r>
               <w:rPr>
                 <w:sz w:val="22"/>
+                <w:lang w:val="ru-RU"/>
               </w:rPr>
-              <w:t>1</w:t>
-            </w:r>
-          </w:p>
-        </w:tc>
-        <w:tc>
-          <w:tcPr>
-            <w:tcW w:w="1211" w:type="dxa"/>
-            <w:vAlign w:val="center"/>
-          </w:tcPr>
-          <w:p>
-            <w:pPr>
-              <w:ind w:firstLine="0"/>
-              <w:jc w:val="center"/>
-            </w:pPr>
-            <w:r>
-              <w:rPr>
-                <w:sz w:val="22"/>
-              </w:rPr>
-              <w:t>6</w:t>
-            </w:r>
-          </w:p>
-        </w:tc>
-        <w:tc>
-          <w:tcPr>
-            <w:tcW w:w="1211" w:type="dxa"/>
-            <w:vAlign w:val="center"/>
-          </w:tcPr>
-          <w:p>
-            <w:pPr>
-              <w:ind w:firstLine="0"/>
-              <w:jc w:val="center"/>
-            </w:pPr>
-            <w:r>
-              <w:rPr>
-                <w:sz w:val="22"/>
-              </w:rPr>
-              <w:t>2,00</w:t>
+              <w:t>3,27</w:t>
             </w:r>
           </w:p>
         </w:tc>
@@ -2554,28 +2742,14 @@
             <w:pPr>
               <w:ind w:firstLine="0"/>
               <w:jc w:val="center"/>
+              <w:rPr>
+                <w:lang w:val="ru-RU"/>
+              </w:rPr>
             </w:pPr>
             <w:r>
               <w:rPr>
                 <w:sz w:val="22"/>
-              </w:rPr>
-              <w:t>4</w:t>
-            </w:r>
-          </w:p>
-        </w:tc>
-        <w:tc>
-          <w:tcPr>
-            <w:tcW w:w="1211" w:type="dxa"/>
-            <w:vAlign w:val="center"/>
-          </w:tcPr>
-          <w:p>
-            <w:pPr>
-              <w:ind w:firstLine="0"/>
-              <w:jc w:val="center"/>
-            </w:pPr>
-            <w:r>
-              <w:rPr>
-                <w:sz w:val="22"/>
+                <w:lang w:val="ru-RU"/>
               </w:rPr>
               <w:t>2</w:t>
             </w:r>
@@ -2590,12 +2764,16 @@
             <w:pPr>
               <w:ind w:firstLine="0"/>
               <w:jc w:val="center"/>
+              <w:rPr>
+                <w:lang w:val="ru-RU"/>
+              </w:rPr>
             </w:pPr>
             <w:r>
               <w:rPr>
                 <w:sz w:val="22"/>
+                <w:lang w:val="ru-RU"/>
               </w:rPr>
-              <w:t>2</w:t>
+              <w:t>0</w:t>
             </w:r>
           </w:p>
         </w:tc>
@@ -2608,12 +2786,16 @@
             <w:pPr>
               <w:ind w:firstLine="0"/>
               <w:jc w:val="center"/>
+              <w:rPr>
+                <w:lang w:val="ru-RU"/>
+              </w:rPr>
             </w:pPr>
             <w:r>
               <w:rPr>
                 <w:sz w:val="22"/>
+                <w:lang w:val="ru-RU"/>
               </w:rPr>
-              <w:t>2</w:t>
+              <w:t>1</w:t>
             </w:r>
           </w:p>
         </w:tc>
@@ -2626,12 +2808,16 @@
             <w:pPr>
               <w:ind w:firstLine="0"/>
               <w:jc w:val="center"/>
+              <w:rPr>
+                <w:lang w:val="ru-RU"/>
+              </w:rPr>
             </w:pPr>
             <w:r>
               <w:rPr>
                 <w:sz w:val="22"/>
+                <w:lang w:val="ru-RU"/>
               </w:rPr>
-              <w:t>10</w:t>
+              <w:t>0</w:t>
             </w:r>
           </w:p>
         </w:tc>
@@ -2644,12 +2830,37 @@
             <w:pPr>
               <w:ind w:firstLine="0"/>
               <w:jc w:val="center"/>
+              <w:rPr>
+                <w:lang w:val="ru-RU"/>
+              </w:rPr>
             </w:pPr>
             <w:r>
               <w:rPr>
                 <w:sz w:val="22"/>
+                <w:lang w:val="ru-RU"/>
               </w:rPr>
-              <w:t>3,34</w:t>
+              <w:t>3</w:t>
+            </w:r>
+          </w:p>
+        </w:tc>
+        <w:tc>
+          <w:tcPr>
+            <w:tcW w:w="1211" w:type="dxa"/>
+            <w:vAlign w:val="center"/>
+          </w:tcPr>
+          <w:p>
+            <w:pPr>
+              <w:ind w:firstLine="0"/>
+              <w:jc w:val="center"/>
+              <w:rPr>
+                <w:lang w:val="ru-RU"/>
+              </w:rPr>
+            </w:pPr>
+            <w:r>
+              <w:rPr>
+                <w:lang w:val="ru-RU"/>
+              </w:rPr>
+              <w:t>3,28</w:t>
             </w:r>
           </w:p>
         </w:tc>
@@ -2703,28 +2914,14 @@
             <w:pPr>
               <w:ind w:firstLine="0"/>
               <w:jc w:val="center"/>
+              <w:rPr>
+                <w:lang w:val="ru-RU"/>
+              </w:rPr>
             </w:pPr>
             <w:r>
               <w:rPr>
                 <w:sz w:val="22"/>
-              </w:rPr>
-              <w:t>2</w:t>
-            </w:r>
-          </w:p>
-        </w:tc>
-        <w:tc>
-          <w:tcPr>
-            <w:tcW w:w="1211" w:type="dxa"/>
-            <w:vAlign w:val="center"/>
-          </w:tcPr>
-          <w:p>
-            <w:pPr>
-              <w:ind w:firstLine="0"/>
-              <w:jc w:val="center"/>
-            </w:pPr>
-            <w:r>
-              <w:rPr>
-                <w:sz w:val="22"/>
+                <w:lang w:val="ru-RU"/>
               </w:rPr>
               <w:t>1</w:t>
             </w:r>
@@ -2739,10 +2936,80 @@
             <w:pPr>
               <w:ind w:firstLine="0"/>
               <w:jc w:val="center"/>
+              <w:rPr>
+                <w:lang w:val="ru-RU"/>
+              </w:rPr>
             </w:pPr>
             <w:r>
               <w:rPr>
                 <w:sz w:val="22"/>
+                <w:lang w:val="ru-RU"/>
+              </w:rPr>
+              <w:t>0</w:t>
+            </w:r>
+          </w:p>
+        </w:tc>
+        <w:tc>
+          <w:tcPr>
+            <w:tcW w:w="1211" w:type="dxa"/>
+            <w:vAlign w:val="center"/>
+          </w:tcPr>
+          <w:p>
+            <w:pPr>
+              <w:ind w:firstLine="0"/>
+              <w:jc w:val="center"/>
+              <w:rPr>
+                <w:lang w:val="ru-RU"/>
+              </w:rPr>
+            </w:pPr>
+            <w:r>
+              <w:rPr>
+                <w:sz w:val="22"/>
+                <w:lang w:val="ru-RU"/>
+              </w:rPr>
+              <w:t>0</w:t>
+            </w:r>
+          </w:p>
+        </w:tc>
+        <w:tc>
+          <w:tcPr>
+            <w:tcW w:w="1211" w:type="dxa"/>
+            <w:vAlign w:val="center"/>
+          </w:tcPr>
+          <w:p>
+            <w:pPr>
+              <w:ind w:firstLine="0"/>
+              <w:jc w:val="center"/>
+              <w:rPr>
+                <w:lang w:val="ru-RU"/>
+              </w:rPr>
+            </w:pPr>
+            <w:r>
+              <w:rPr>
+                <w:sz w:val="22"/>
+                <w:lang w:val="ru-RU"/>
+              </w:rPr>
+              <w:t>0</w:t>
+            </w:r>
+          </w:p>
+        </w:tc>
+        <w:tc>
+          <w:tcPr>
+            <w:tcW w:w="1211" w:type="dxa"/>
+            <w:vAlign w:val="center"/>
+          </w:tcPr>
+          <w:p>
+            <w:pPr>
+              <w:ind w:firstLine="0"/>
+              <w:jc w:val="center"/>
+              <w:rPr>
+                <w:lang w:val="ru-RU"/>
+              </w:rPr>
+            </w:pPr>
+            <w:r>
+              <w:rPr>
+                <w:sz w:val="22"/>
+                <w:lang w:val="ru-RU"/>
               </w:rPr>
               <w:t>1</w:t>
             </w:r>
@@ -2757,48 +3024,16 @@
             <w:pPr>
               <w:ind w:firstLine="0"/>
               <w:jc w:val="center"/>
+              <w:rPr>
+                <w:lang w:val="ru-RU"/>
+              </w:rPr>
             </w:pPr>
             <w:r>
               <w:rPr>
                 <w:sz w:val="22"/>
+                <w:lang w:val="ru-RU"/>
               </w:rPr>
-              <w:t>2</w:t>
-            </w:r>
-          </w:p>
-        </w:tc>
-        <w:tc>
-          <w:tcPr>
-            <w:tcW w:w="1211" w:type="dxa"/>
-            <w:vAlign w:val="center"/>
-          </w:tcPr>
-          <w:p>
-            <w:pPr>
-              <w:ind w:firstLine="0"/>
-              <w:jc w:val="center"/>
-            </w:pPr>
-            <w:r>
-              <w:rPr>
-                <w:sz w:val="22"/>
-              </w:rPr>
-              <w:t>6</w:t>
-            </w:r>
-          </w:p>
-        </w:tc>
-        <w:tc>
-          <w:tcPr>
-            <w:tcW w:w="1211" w:type="dxa"/>
-            <w:vAlign w:val="center"/>
-          </w:tcPr>
-          <w:p>
-            <w:pPr>
-              <w:ind w:firstLine="0"/>
-              <w:jc w:val="center"/>
-            </w:pPr>
-            <w:r>
-              <w:rPr>
-                <w:sz w:val="22"/>
-              </w:rPr>
-              <w:t>2,00</w:t>
+              <w:t>1,09</w:t>
             </w:r>
           </w:p>
         </w:tc>
@@ -2816,6 +3051,9 @@
             <w:pPr>
               <w:ind w:firstLine="0"/>
               <w:jc w:val="center"/>
+              <w:rPr>
+                <w:lang w:val="ru-RU"/>
+              </w:rPr>
             </w:pPr>
           </w:p>
         </w:tc>
@@ -2894,12 +3132,16 @@
             <w:pPr>
               <w:ind w:firstLine="0"/>
               <w:jc w:val="center"/>
+              <w:rPr>
+                <w:lang w:val="ru-RU"/>
+              </w:rPr>
             </w:pPr>
             <w:r>
               <w:rPr>
                 <w:sz w:val="22"/>
+                <w:lang w:val="ru-RU"/>
               </w:rPr>
-              <w:t>36</w:t>
+              <w:t>11</w:t>
             </w:r>
           </w:p>
         </w:tc>
@@ -2932,7 +3174,6 @@
     </w:p>
     <w:p>
       <w:r>
-        <w:lastRenderedPageBreak/>
         <w:t>4. Организация работы команды</w:t>
       </w:r>
     </w:p>
@@ -3053,12 +3294,16 @@
             <w:pPr>
               <w:ind w:firstLine="0"/>
               <w:jc w:val="center"/>
+              <w:rPr>
+                <w:lang w:val="ru-RU"/>
+              </w:rPr>
             </w:pPr>
             <w:r>
               <w:rPr>
                 <w:sz w:val="22"/>
+                <w:lang w:val="ru-RU"/>
               </w:rPr>
-              <w:t>Управление мероприятиями, общая координация</w:t>
+              <w:t>М1. Управление мероприятиями; М2. Регистрация и участники</w:t>
             </w:r>
           </w:p>
         </w:tc>
@@ -3071,12 +3316,22 @@
             <w:pPr>
               <w:ind w:firstLine="0"/>
               <w:jc w:val="center"/>
+              <w:rPr>
+                <w:lang w:val="ru-RU"/>
+              </w:rPr>
             </w:pPr>
             <w:r>
               <w:rPr>
                 <w:sz w:val="22"/>
               </w:rPr>
-              <w:t>4,0</w:t>
+              <w:t>4,</w:t>
+            </w:r>
+            <w:r>
+              <w:rPr>
+                <w:sz w:val="22"/>
+                <w:lang w:val="ru-RU"/>
+              </w:rPr>
+              <w:t>36</w:t>
             </w:r>
           </w:p>
         </w:tc>
@@ -3117,7 +3372,7 @@
               <w:rPr>
                 <w:sz w:val="22"/>
               </w:rPr>
-              <w:t>Регистрация, участники, помещения</w:t>
+              <w:t>М3. Помещения</w:t>
             </w:r>
           </w:p>
         </w:tc>
@@ -3130,12 +3385,17 @@
             <w:pPr>
               <w:ind w:firstLine="0"/>
               <w:jc w:val="center"/>
+              <w:rPr>
+                <w:sz w:val="22"/>
+                <w:lang w:val="ru-RU"/>
+              </w:rPr>
             </w:pPr>
             <w:r>
               <w:rPr>
                 <w:sz w:val="22"/>
+                <w:lang w:val="ru-RU"/>
               </w:rPr>
-              <w:t>4,0</w:t>
+              <w:t>3,27</w:t>
             </w:r>
           </w:p>
         </w:tc>
@@ -3180,7 +3440,13 @@
                 <w:sz w:val="22"/>
                 <w:lang w:val="ru-RU"/>
               </w:rPr>
-              <w:t>Программа, проведение, результаты и сертификаты</w:t>
+              <w:t xml:space="preserve">М4. Программа и проведение; М5. </w:t>
+            </w:r>
+            <w:r>
+              <w:rPr>
+                <w:sz w:val="22"/>
+              </w:rPr>
+              <w:t>Результаты и сертификаты</w:t>
             </w:r>
           </w:p>
         </w:tc>
@@ -3198,7 +3464,7 @@
               <w:rPr>
                 <w:sz w:val="22"/>
               </w:rPr>
-              <w:t>4,0</w:t>
+              <w:t>4,37</w:t>
             </w:r>
           </w:p>
         </w:tc>
@@ -3257,6 +3523,15 @@
         </w:tc>
       </w:tr>
     </w:tbl>
+    <w:p>
+      <w:pPr>
+        <w:ind w:firstLine="0"/>
+        <w:rPr>
+          <w:sz w:val="22"/>
+          <w:lang w:val="ru-RU"/>
+        </w:rPr>
+      </w:pPr>
+    </w:p>
     <w:p>
       <w:pPr>
         <w:ind w:firstLine="0"/>
@@ -3476,14 +3751,12 @@
     </w:tbl>
     <w:p>
       <w:pPr>
-        <w:jc w:val="center"/>
         <w:rPr>
           <w:lang w:val="ru-RU"/>
         </w:rPr>
       </w:pPr>
       <w:r>
         <w:rPr>
-          <w:sz w:val="22"/>
           <w:lang w:val="ru-RU"/>
         </w:rPr>
         <w:lastRenderedPageBreak/>
@@ -3491,6 +3764,20 @@
       </w:r>
       <w:r>
         <w:rPr>
+          <w:noProof/>
+        </w:rPr>
+        <w:t xml:space="preserve"> </w:t>
+      </w:r>
+      <w:r>
+        <w:rPr>
+          <w:noProof/>
+          <w:lang w:val="ru-RU"/>
+        </w:rPr>
+        <w:t xml:space="preserve"> </w:t>
+      </w:r>
+      <w:r>
+        <w:rPr>
+          <w:noProof/>
           <w:lang w:val="ru-RU"/>
         </w:rPr>
         <w:drawing>
@@ -3542,33 +3829,29 @@
           <w:sz w:val="22"/>
           <w:lang w:val="ru-RU"/>
         </w:rPr>
-        <w:t>В качестве наиболее сложного варианта использования выбрано «Провести мероприятие». Диаграмма показывает взаимодействие организатора, системы и преподавателя. Предусмотрены ветвления при проверке готовности и переход между секциями программы.</w:t>
+        <w:t>В качестве наиболее сложного варианта использования выбран вариант «Провести мероприятие». Диаграмма отражает взаимодействие организатора, системы и преподавателя. Перед началом мероприятия проверяется готовность помещения и программы. При обнаружении проблемы организатор устраняет её, после чего проверка выполняется повторно. После подтверждения готовности начинается мероприятие, преподаватель проводит секции, а система фиксирует их выполнение. Если остаются следующие секции, процесс повторяется. После завершения всех секций мероприятие завершается и система формирует результаты.</w:t>
       </w:r>
     </w:p>
     <w:p>
       <w:pPr>
         <w:rPr>
-          <w:sz w:val="22"/>
           <w:lang w:val="ru-RU"/>
         </w:rPr>
       </w:pPr>
       <w:r>
         <w:rPr>
-          <w:sz w:val="22"/>
           <w:lang w:val="ru-RU"/>
         </w:rPr>
         <w:t xml:space="preserve">6. </w:t>
       </w:r>
       <w:r>
         <w:rPr>
-          <w:sz w:val="22"/>
           <w:lang w:val="ru-RU"/>
         </w:rPr>
         <w:t>В</w:t>
       </w:r>
       <w:r>
         <w:rPr>
-          <w:sz w:val="22"/>
           <w:lang w:val="ru-RU"/>
         </w:rPr>
         <w:t>ывод</w:t>
@@ -3577,7 +3860,6 @@
     <w:p>
       <w:pPr>
         <w:rPr>
-          <w:sz w:val="22"/>
           <w:lang w:val="ru-RU"/>
         </w:rPr>
       </w:pPr>
@@ -3600,7 +3882,22 @@
           <w:sz w:val="22"/>
           <w:lang w:val="ru-RU"/>
         </w:rPr>
-        <w:t>ры и варианты использования, сформирована модель классов, выделены функциональные модули и распределены 12 человеко-месяцев между ними. Также описан процесс проведения мероприятия с учётом проверки готовности и возможных повторных действий. Полученная модель может использоваться как основа для дальнейшего проектирования архитектуры системы.</w:t>
+        <w:t>ры и варианты использования, сформирована модель классов, выделены функциональные модули и распределены 12 человеко-месяцев между ними. Также описан процесс проведения мероприятия с учётом проверки готовности и возможных повторных</w:t>
+      </w:r>
+      <w:r>
+        <w:rPr>
+          <w:sz w:val="22"/>
+          <w:lang w:val="ru-RU"/>
+        </w:rPr>
+        <w:t xml:space="preserve"> </w:t>
+      </w:r>
+      <w:r>
+        <w:rPr>
+          <w:sz w:val="22"/>
+          <w:lang w:val="ru-RU"/>
+        </w:rPr>
+        <w:lastRenderedPageBreak/>
+        <w:t>действий. Полученная модель может использоваться как основа для дальнейшего проектирования архитектуры системы.</w:t>
       </w:r>
     </w:p>
     <w:sectPr>

</xml_diff>

<commit_message>
fix: correct practical work 2 and make minor fixes to work 1
</commit_message>
<xml_diff>
--- a/Практическая_работа_1_Система_управления_мероприятиями.docx
+++ b/Практическая_работа_1_Система_управления_мероприятиями.docx
@@ -116,6 +116,7 @@
       <w:r>
         <w:rPr>
           <w:rFonts w:ascii="Courier New" w:hAnsi="Courier New"/>
+          <w:noProof/>
           <w:sz w:val="18"/>
           <w:lang w:val="ru-RU"/>
         </w:rPr>
@@ -1252,159 +1253,21 @@
       </w:pPr>
       <w:r>
         <w:rPr>
-          <w:sz w:val="22"/>
-          <w:lang w:val="ru-RU"/>
-        </w:rPr>
-        <w:t xml:space="preserve">Диаграмма классов описывает основные сущности системы и связи между ними. Связь участника с мероприятием выполняется через класс «Регистрация», что позволяет хранить сведения о дате регистрации, статусе и факте присутствия. </w:t>
-      </w:r>
-      <w:r>
-        <w:rPr>
-          <w:sz w:val="22"/>
-          <w:lang w:val="ru-RU"/>
-        </w:rPr>
-        <w:t xml:space="preserve">Между классами </w:t>
-      </w:r>
-      <w:r>
-        <w:rPr>
-          <w:sz w:val="22"/>
-          <w:lang w:val="ru-RU"/>
-        </w:rPr>
-        <w:t>«</w:t>
-      </w:r>
-      <w:r>
-        <w:rPr>
-          <w:sz w:val="22"/>
-          <w:lang w:val="ru-RU"/>
-        </w:rPr>
-        <w:t>Мероприятие</w:t>
-      </w:r>
-      <w:r>
-        <w:rPr>
-          <w:sz w:val="22"/>
-          <w:lang w:val="ru-RU"/>
-        </w:rPr>
-        <w:t>»</w:t>
-      </w:r>
-      <w:r>
-        <w:rPr>
-          <w:sz w:val="22"/>
-          <w:lang w:val="ru-RU"/>
-        </w:rPr>
-        <w:t xml:space="preserve"> и </w:t>
-      </w:r>
-      <w:r>
-        <w:rPr>
-          <w:sz w:val="22"/>
-          <w:lang w:val="ru-RU"/>
-        </w:rPr>
-        <w:t>«</w:t>
-      </w:r>
-      <w:r>
-        <w:rPr>
-          <w:sz w:val="22"/>
-          <w:lang w:val="ru-RU"/>
-        </w:rPr>
-        <w:t>Программа</w:t>
-      </w:r>
-      <w:r>
-        <w:rPr>
-          <w:sz w:val="22"/>
-          <w:lang w:val="ru-RU"/>
-        </w:rPr>
-        <w:t>»</w:t>
-      </w:r>
-      <w:r>
-        <w:rPr>
-          <w:sz w:val="22"/>
-          <w:lang w:val="ru-RU"/>
-        </w:rPr>
-        <w:t xml:space="preserve">, а также </w:t>
-      </w:r>
-      <w:r>
-        <w:rPr>
-          <w:sz w:val="22"/>
-          <w:lang w:val="ru-RU"/>
-        </w:rPr>
-        <w:t>«</w:t>
-      </w:r>
-      <w:r>
-        <w:rPr>
-          <w:sz w:val="22"/>
-          <w:lang w:val="ru-RU"/>
-        </w:rPr>
-        <w:t>Программа</w:t>
-      </w:r>
-      <w:r>
-        <w:rPr>
-          <w:sz w:val="22"/>
-          <w:lang w:val="ru-RU"/>
-        </w:rPr>
-        <w:t>»</w:t>
-      </w:r>
-      <w:r>
-        <w:rPr>
-          <w:sz w:val="22"/>
-          <w:lang w:val="ru-RU"/>
-        </w:rPr>
-        <w:t xml:space="preserve"> и </w:t>
-      </w:r>
-      <w:r>
-        <w:rPr>
-          <w:sz w:val="22"/>
-          <w:lang w:val="ru-RU"/>
-        </w:rPr>
-        <w:t>«</w:t>
-      </w:r>
-      <w:r>
-        <w:rPr>
-          <w:sz w:val="22"/>
-          <w:lang w:val="ru-RU"/>
-        </w:rPr>
-        <w:t>Секция</w:t>
-      </w:r>
-      <w:r>
-        <w:rPr>
-          <w:sz w:val="22"/>
-          <w:lang w:val="ru-RU"/>
-        </w:rPr>
-        <w:t>»</w:t>
-      </w:r>
-      <w:r>
-        <w:rPr>
-          <w:sz w:val="22"/>
-          <w:lang w:val="ru-RU"/>
-        </w:rPr>
-        <w:t xml:space="preserve"> использована композиция, отражающая зависимость частей от соответствующего целого</w:t>
-      </w:r>
-      <w:r>
-        <w:rPr>
-          <w:sz w:val="22"/>
-          <w:lang w:val="ru-RU"/>
-        </w:rPr>
-        <w:t>.</w:t>
-      </w:r>
-      <w:r>
-        <w:rPr>
-          <w:sz w:val="22"/>
-          <w:lang w:val="ru-RU"/>
-        </w:rPr>
-        <w:t xml:space="preserve"> </w:t>
-      </w:r>
-    </w:p>
-    <w:p>
-      <w:pPr>
-        <w:rPr>
-          <w:lang w:val="ru-RU"/>
-        </w:rPr>
-      </w:pPr>
-      <w:r>
-        <w:rPr>
+          <w:noProof/>
           <w:lang w:val="ru-RU"/>
         </w:rPr>
         <w:drawing>
-          <wp:inline distT="0" distB="0" distL="0" distR="0" wp14:anchorId="1D54687F" wp14:editId="3317E1BD">
-            <wp:extent cx="5567423" cy="4340050"/>
-            <wp:effectExtent l="0" t="0" r="0" b="3810"/>
+          <wp:anchor distT="0" distB="0" distL="114300" distR="114300" simplePos="0" relativeHeight="251658240" behindDoc="0" locked="0" layoutInCell="1" allowOverlap="1" wp14:anchorId="1D54687F" wp14:editId="00F120AC">
+            <wp:simplePos x="0" y="0"/>
+            <wp:positionH relativeFrom="column">
+              <wp:posOffset>262030</wp:posOffset>
+            </wp:positionH>
+            <wp:positionV relativeFrom="paragraph">
+              <wp:posOffset>1574656</wp:posOffset>
+            </wp:positionV>
+            <wp:extent cx="5629910" cy="4388485"/>
+            <wp:effectExtent l="0" t="0" r="8890" b="0"/>
+            <wp:wrapTopAndBottom/>
             <wp:docPr id="156418667" name="Рисунок 1"/>
             <wp:cNvGraphicFramePr>
               <a:graphicFrameLocks xmlns:a="http://schemas.openxmlformats.org/drawingml/2006/main" noChangeAspect="1"/>
@@ -1425,7 +1288,7 @@
                   <pic:spPr>
                     <a:xfrm>
                       <a:off x="0" y="0"/>
-                      <a:ext cx="5589740" cy="4357447"/>
+                      <a:ext cx="5629910" cy="4388485"/>
                     </a:xfrm>
                     <a:prstGeom prst="rect">
                       <a:avLst/>
@@ -1434,24 +1297,47 @@
                 </pic:pic>
               </a:graphicData>
             </a:graphic>
-          </wp:inline>
+            <wp14:sizeRelH relativeFrom="margin">
+              <wp14:pctWidth>0</wp14:pctWidth>
+            </wp14:sizeRelH>
+            <wp14:sizeRelV relativeFrom="margin">
+              <wp14:pctHeight>0</wp14:pctHeight>
+            </wp14:sizeRelV>
+          </wp:anchor>
         </w:drawing>
+      </w:r>
+      <w:r>
+        <w:rPr>
+          <w:sz w:val="22"/>
+          <w:lang w:val="ru-RU"/>
+        </w:rPr>
+        <w:t>Диаграмма классов описывает основные сущности системы и связи между ними. Связь участника с мероприятием выполняется через класс «Регистрация», что позволяет хранить сведения о дате регистрации, статусе и факте присутствия.</w:t>
+      </w:r>
+      <w:r>
+        <w:rPr>
+          <w:rFonts w:eastAsia="Times New Roman" w:cs="Times New Roman"/>
+          <w:sz w:val="24"/>
+          <w:szCs w:val="24"/>
+          <w:lang w:val="ru-RU"/>
+        </w:rPr>
+        <w:t xml:space="preserve"> </w:t>
+      </w:r>
+      <w:r>
+        <w:rPr>
+          <w:sz w:val="22"/>
+          <w:lang w:val="ru-RU"/>
+        </w:rPr>
+        <w:t>Между классами «Мероприятие» и «Программа», а также «Программа» и «Секция» использована композиция, отражающая зависимость частей от соответствующего целого. Для каждой программы предусмотрено одно мероприятие, а программа может включать одну или несколько секций.</w:t>
       </w:r>
     </w:p>
     <w:p>
       <w:pPr>
-        <w:spacing w:line="276" w:lineRule="auto"/>
-        <w:ind w:firstLine="0"/>
+        <w:jc w:val="center"/>
         <w:rPr>
+          <w:sz w:val="22"/>
           <w:lang w:val="ru-RU"/>
         </w:rPr>
       </w:pPr>
-      <w:r>
-        <w:rPr>
-          <w:lang w:val="ru-RU"/>
-        </w:rPr>
-        <w:br w:type="page"/>
-      </w:r>
       <w:r>
         <w:rPr>
           <w:lang w:val="ru-RU"/>
@@ -2853,11 +2739,13 @@
               <w:ind w:firstLine="0"/>
               <w:jc w:val="center"/>
               <w:rPr>
+                <w:sz w:val="22"/>
                 <w:lang w:val="ru-RU"/>
               </w:rPr>
             </w:pPr>
             <w:r>
               <w:rPr>
+                <w:sz w:val="22"/>
                 <w:lang w:val="ru-RU"/>
               </w:rPr>
               <w:t>3,28</w:t>
@@ -3765,6 +3653,7 @@
       <w:r>
         <w:rPr>
           <w:noProof/>
+          <w:lang w:val="ru-RU"/>
         </w:rPr>
         <w:t xml:space="preserve"> </w:t>
       </w:r>
@@ -3781,10 +3670,10 @@
           <w:lang w:val="ru-RU"/>
         </w:rPr>
         <w:drawing>
-          <wp:inline distT="0" distB="0" distL="0" distR="0" wp14:anchorId="2726DCBB" wp14:editId="3D0F15DD">
-            <wp:extent cx="5912913" cy="4341466"/>
-            <wp:effectExtent l="0" t="0" r="0" b="2540"/>
-            <wp:docPr id="911720308" name="Рисунок 1"/>
+          <wp:inline distT="0" distB="0" distL="0" distR="0" wp14:anchorId="42288976" wp14:editId="5A5D30C1">
+            <wp:extent cx="6152515" cy="4547235"/>
+            <wp:effectExtent l="0" t="0" r="635" b="5715"/>
+            <wp:docPr id="1270811745" name="Рисунок 1"/>
             <wp:cNvGraphicFramePr>
               <a:graphicFrameLocks xmlns:a="http://schemas.openxmlformats.org/drawingml/2006/main" noChangeAspect="1"/>
             </wp:cNvGraphicFramePr>
@@ -3792,7 +3681,7 @@
               <a:graphicData uri="http://schemas.openxmlformats.org/drawingml/2006/picture">
                 <pic:pic xmlns:pic="http://schemas.openxmlformats.org/drawingml/2006/picture">
                   <pic:nvPicPr>
-                    <pic:cNvPr id="911720308" name=""/>
+                    <pic:cNvPr id="1270811745" name=""/>
                     <pic:cNvPicPr/>
                   </pic:nvPicPr>
                   <pic:blipFill>
@@ -3804,7 +3693,7 @@
                   <pic:spPr>
                     <a:xfrm>
                       <a:off x="0" y="0"/>
-                      <a:ext cx="5921763" cy="4347964"/>
+                      <a:ext cx="6152515" cy="4547235"/>
                     </a:xfrm>
                     <a:prstGeom prst="rect">
                       <a:avLst/>
@@ -20029,6 +19918,19 @@
       <w:lang w:val="uk-UA" w:eastAsia="ru-RU"/>
     </w:rPr>
   </w:style>
+  <w:style w:type="paragraph" w:styleId="aff9">
+    <w:name w:val="Normal (Web)"/>
+    <w:basedOn w:val="a1"/>
+    <w:uiPriority w:val="99"/>
+    <w:semiHidden/>
+    <w:unhideWhenUsed/>
+    <w:rsid w:val="006A17F6"/>
+    <w:rPr>
+      <w:rFonts w:cs="Times New Roman"/>
+      <w:sz w:val="24"/>
+      <w:szCs w:val="24"/>
+    </w:rPr>
+  </w:style>
 </w:styles>
 </file>
 

</xml_diff>